<commit_message>
fix: Update admin single and bulk PDF templates with the complete text layouts of Short Stay and Parent Consent forms
</commit_message>
<xml_diff>
--- a/admin_aarambh/public/Parent Consent Form- revised.docx
+++ b/admin_aarambh/public/Parent Consent Form- revised.docx
@@ -4,10 +4,21 @@
   <w:body>
     <w:p>
       <w:r>
+        <w:rPr>
+          <w:noProof/>
+        </w:rPr>
         <w:drawing>
-          <wp:inline distT="0" distB="0" distL="0" distR="0" wp14:anchorId="4E6F20FA" wp14:editId="3F7D4C61">
-            <wp:extent cx="5731510" cy="7694295"/>
-            <wp:effectExtent l="0" t="0" r="0" b="1905"/>
+          <wp:anchor distT="0" distB="0" distL="114300" distR="114300" simplePos="0" relativeHeight="251658240" behindDoc="0" locked="0" layoutInCell="1" allowOverlap="1" wp14:anchorId="4E6F20FA" wp14:editId="40B5FDB2">
+            <wp:simplePos x="0" y="0"/>
+            <wp:positionH relativeFrom="column">
+              <wp:posOffset>-810757</wp:posOffset>
+            </wp:positionH>
+            <wp:positionV relativeFrom="paragraph">
+              <wp:posOffset>-460927</wp:posOffset>
+            </wp:positionV>
+            <wp:extent cx="7418567" cy="9959093"/>
+            <wp:effectExtent l="0" t="0" r="0" b="4445"/>
+            <wp:wrapNone/>
             <wp:docPr id="886909510" name="Picture 2"/>
             <wp:cNvGraphicFramePr>
               <a:graphicFrameLocks xmlns:a="http://schemas.openxmlformats.org/drawingml/2006/main" noChangeAspect="1"/>
@@ -37,7 +48,7 @@
                   <pic:spPr bwMode="auto">
                     <a:xfrm>
                       <a:off x="0" y="0"/>
-                      <a:ext cx="5731510" cy="7694295"/>
+                      <a:ext cx="7418567" cy="9959093"/>
                     </a:xfrm>
                     <a:prstGeom prst="rect">
                       <a:avLst/>
@@ -50,7 +61,13 @@
                 </pic:pic>
               </a:graphicData>
             </a:graphic>
-          </wp:inline>
+            <wp14:sizeRelH relativeFrom="margin">
+              <wp14:pctWidth>0</wp14:pctWidth>
+            </wp14:sizeRelH>
+            <wp14:sizeRelV relativeFrom="margin">
+              <wp14:pctHeight>0</wp14:pctHeight>
+            </wp14:sizeRelV>
+          </wp:anchor>
         </w:drawing>
       </w:r>
     </w:p>

</xml_diff>